<commit_message>
Update May report: fill in Total Spend (£404), Avg CPC (£1.11)
Impressions share still [ADD] — pending client to add column in Google Ads.
CPC dropped 40% MoM (£1.87 → £1.11) while spend held flat at £404.

https://claude.ai/code/session_01PRmb5Sfn2L3M8PEEoRUzEB
</commit_message>
<xml_diff>
--- a/crm/reports/Johnsons_Google_Ads_May_2026.docx
+++ b/crm/reports/Johnsons_Google_Ads_May_2026.docx
@@ -186,7 +186,7 @@
                 <w:color w:val="1A2A3A"/>
                 <w:sz w:val="19"/>
               </w:rPr>
-              <w:t>In May 2026, the campaign delivered 363 clicks at a CTR of 13.12% — up from 215 clicks and 9.13% CTR in April, and running at nearly three times the UK Google Ads average of 4.7%. The optimisation score improved from 74.4% to 90%. 1 confirmed in-person valuation booking was directly attributed to the campaign.</w:t>
+              <w:t>In May 2026, the campaign delivered 363 clicks at a CTR of 13.12% — up from 215 clicks and 9.13% CTR in April, and running at nearly three times the UK Google Ads average of 4.7%. Total spend was £404 (flat month-on-month) while average CPC dropped from £1.87 to £1.11 — a 40% efficiency improvement. The optimisation score improved from 74.4% to 90%. 1 confirmed in-person valuation booking was directly attributed to the campaign.</w:t>
             </w:r>
           </w:p>
           <w:p>
@@ -372,6 +372,51 @@
         <w:tc>
           <w:tcPr>
             <w:tcW w:type="dxa" w:w="3324"/>
+            <w:shd w:val="clear" w:color="auto" w:fill="C8F0D0"/>
+          </w:tcPr>
+          <w:p>
+            <w:pPr>
+              <w:jc w:val="center"/>
+            </w:pPr>
+            <w:r>
+              <w:rPr>
+                <w:b/>
+                <w:color w:val="0A5A20"/>
+                <w:sz w:val="36"/>
+              </w:rPr>
+              <w:t>£1.11</w:t>
+            </w:r>
+          </w:p>
+          <w:p>
+            <w:pPr>
+              <w:jc w:val="center"/>
+            </w:pPr>
+            <w:r>
+              <w:rPr>
+                <w:b/>
+                <w:color w:val="8899AA"/>
+                <w:sz w:val="16"/>
+              </w:rPr>
+              <w:t>Avg. CPC</w:t>
+            </w:r>
+          </w:p>
+          <w:p>
+            <w:pPr>
+              <w:spacing w:after="80"/>
+              <w:jc w:val="center"/>
+            </w:pPr>
+            <w:r>
+              <w:rPr>
+                <w:color w:val="C8A840"/>
+                <w:sz w:val="16"/>
+              </w:rPr>
+              <w:t>↓ from £1.87 in April</w:t>
+            </w:r>
+          </w:p>
+        </w:tc>
+        <w:tc>
+          <w:tcPr>
+            <w:tcW w:type="dxa" w:w="3324"/>
             <w:shd w:val="clear" w:color="auto" w:fill="EEF2FA"/>
           </w:tcPr>
           <w:p>
@@ -384,7 +429,7 @@
                 <w:color w:val="0D2045"/>
                 <w:sz w:val="36"/>
               </w:rPr>
-              <w:t>[ADD]</w:t>
+              <w:t>£404</w:t>
             </w:r>
           </w:p>
           <w:p>
@@ -397,7 +442,7 @@
                 <w:color w:val="8899AA"/>
                 <w:sz w:val="16"/>
               </w:rPr>
-              <w:t>Avg. CPC</w:t>
+              <w:t>Total Spend</w:t>
             </w:r>
           </w:p>
           <w:p>
@@ -410,52 +455,7 @@
                 <w:color w:val="C8A840"/>
                 <w:sz w:val="16"/>
               </w:rPr>
-              <w:t>vs £1.87 in April</w:t>
-            </w:r>
-          </w:p>
-        </w:tc>
-        <w:tc>
-          <w:tcPr>
-            <w:tcW w:type="dxa" w:w="3324"/>
-            <w:shd w:val="clear" w:color="auto" w:fill="EEF2FA"/>
-          </w:tcPr>
-          <w:p>
-            <w:pPr>
-              <w:jc w:val="center"/>
-            </w:pPr>
-            <w:r>
-              <w:rPr>
-                <w:b/>
-                <w:color w:val="0D2045"/>
-                <w:sz w:val="36"/>
-              </w:rPr>
-              <w:t>[ADD]</w:t>
-            </w:r>
-          </w:p>
-          <w:p>
-            <w:pPr>
-              <w:jc w:val="center"/>
-            </w:pPr>
-            <w:r>
-              <w:rPr>
-                <w:b/>
-                <w:color w:val="8899AA"/>
-                <w:sz w:val="16"/>
-              </w:rPr>
-              <w:t>Total Spend</w:t>
-            </w:r>
-          </w:p>
-          <w:p>
-            <w:pPr>
-              <w:spacing w:after="80"/>
-              <w:jc w:val="center"/>
-            </w:pPr>
-            <w:r>
-              <w:rPr>
-                <w:color w:val="C8A840"/>
-                <w:sz w:val="16"/>
-              </w:rPr>
-              <w:t>vs £403 in April</w:t>
+              <w:t>≈ flat vs £403 in April</w:t>
             </w:r>
           </w:p>
         </w:tc>
@@ -1087,10 +1087,10 @@
               <w:rPr>
                 <w:b w:val="0"/>
                 <w:i w:val="0"/>
-                <w:color w:val="1A2A3A"/>
+                <w:color w:val="0A5A20"/>
                 <w:sz w:val="18"/>
               </w:rPr>
-              <w:t>[ADD]</w:t>
+              <w:t>£1.11</w:t>
             </w:r>
           </w:p>
         </w:tc>
@@ -1098,6 +1098,29 @@
           <w:tcPr>
             <w:tcW w:type="dxa" w:w="2493"/>
             <w:shd w:val="clear" w:color="auto" w:fill="FFFFFF"/>
+            <w:vAlign w:val="center"/>
+          </w:tcPr>
+          <w:p>
+            <w:pPr>
+              <w:jc w:val="left"/>
+            </w:pPr>
+            <w:r>
+              <w:rPr>
+                <w:b/>
+                <w:i w:val="0"/>
+                <w:color w:val="0A5A20"/>
+                <w:sz w:val="18"/>
+              </w:rPr>
+              <w:t>↓ £0.76 (−40%)</w:t>
+            </w:r>
+          </w:p>
+        </w:tc>
+      </w:tr>
+      <w:tr>
+        <w:tc>
+          <w:tcPr>
+            <w:tcW w:type="dxa" w:w="2493"/>
+            <w:shd w:val="clear" w:color="auto" w:fill="F7F9FD"/>
             <w:vAlign w:val="center"/>
           </w:tcPr>
           <w:p>
@@ -1111,12 +1134,10 @@
                 <w:color w:val="1A2A3A"/>
                 <w:sz w:val="18"/>
               </w:rPr>
-              <w:t>[ADD]</w:t>
-            </w:r>
-          </w:p>
-        </w:tc>
-      </w:tr>
-      <w:tr>
+              <w:t>Total Spend</w:t>
+            </w:r>
+          </w:p>
+        </w:tc>
         <w:tc>
           <w:tcPr>
             <w:tcW w:type="dxa" w:w="2493"/>
@@ -1134,7 +1155,7 @@
                 <w:color w:val="1A2A3A"/>
                 <w:sz w:val="18"/>
               </w:rPr>
-              <w:t>Total Spend</w:t>
+              <w:t>£403</w:t>
             </w:r>
           </w:p>
         </w:tc>
@@ -1155,7 +1176,7 @@
                 <w:color w:val="1A2A3A"/>
                 <w:sz w:val="18"/>
               </w:rPr>
-              <w:t>£403</w:t>
+              <w:t>£404</w:t>
             </w:r>
           </w:p>
         </w:tc>
@@ -1176,28 +1197,7 @@
                 <w:color w:val="1A2A3A"/>
                 <w:sz w:val="18"/>
               </w:rPr>
-              <w:t>[ADD]</w:t>
-            </w:r>
-          </w:p>
-        </w:tc>
-        <w:tc>
-          <w:tcPr>
-            <w:tcW w:type="dxa" w:w="2493"/>
-            <w:shd w:val="clear" w:color="auto" w:fill="F7F9FD"/>
-            <w:vAlign w:val="center"/>
-          </w:tcPr>
-          <w:p>
-            <w:pPr>
-              <w:jc w:val="left"/>
-            </w:pPr>
-            <w:r>
-              <w:rPr>
-                <w:b w:val="0"/>
-                <w:i w:val="0"/>
-                <w:color w:val="1A2A3A"/>
-                <w:sz w:val="18"/>
-              </w:rPr>
-              <w:t>[ADD]</w:t>
+              <w:t>+£1 (flat)</w:t>
             </w:r>
           </w:p>
         </w:tc>
@@ -1873,7 +1873,7 @@
                 <w:i w:val="0"/>
                 <w:sz w:val="18"/>
               </w:rPr>
-              <w:t>[ADD]</w:t>
+              <w:t>£1.11</w:t>
             </w:r>
           </w:p>
         </w:tc>
@@ -1934,7 +1934,7 @@
                 <w:color w:val="0A5A20"/>
                 <w:sz w:val="17"/>
               </w:rPr>
-              <w:t>▲ Under benchmark (good)</w:t>
+              <w:t>▲ 43% under benchmark</w:t>
             </w:r>
           </w:p>
         </w:tc>
@@ -8008,12 +8008,12 @@
             </w:pPr>
             <w:r>
               <w:rPr>
-                <w:b w:val="0"/>
+                <w:b/>
                 <w:i w:val="0"/>
-                <w:color w:val="1A2A3A"/>
+                <w:color w:val="0A5A20"/>
                 <w:sz w:val="18"/>
               </w:rPr>
-              <w:t>[ADD]</w:t>
+              <w:t>£1.11 ✓</w:t>
             </w:r>
           </w:p>
         </w:tc>

</xml_diff>

<commit_message>
Fill in Impression Share (11.64%) and update competition section
All [ADD] placeholders now resolved. Competition section updated:
- onthemarket.com grew from <10% to 19.22% impression share in May
- Johnsons dropped from 20.26% to 11.64% (budget constraint, not quality)
- churchill-living.co.uk dropped out of auctions entirely
- May and April auction tables shown side-by-side for comparison

https://claude.ai/code/session_01PRmb5Sfn2L3M8PEEoRUzEB
</commit_message>
<xml_diff>
--- a/crm/reports/Johnsons_Google_Ads_May_2026.docx
+++ b/crm/reports/Johnsons_Google_Ads_May_2026.docx
@@ -1348,7 +1348,7 @@
                 <w:color w:val="1A2A3A"/>
                 <w:sz w:val="18"/>
               </w:rPr>
-              <w:t>[ADD]</w:t>
+              <w:t>11.64%</w:t>
             </w:r>
           </w:p>
         </w:tc>
@@ -1369,7 +1369,7 @@
                 <w:color w:val="1A2A3A"/>
                 <w:sz w:val="18"/>
               </w:rPr>
-              <w:t>[ADD]</w:t>
+              <w:t>↓ −8.62pp (−43%)</w:t>
             </w:r>
           </w:p>
         </w:tc>
@@ -2079,7 +2079,7 @@
                 <w:i w:val="0"/>
                 <w:sz w:val="18"/>
               </w:rPr>
-              <w:t>[ADD]</w:t>
+              <w:t>11.64%</w:t>
             </w:r>
           </w:p>
         </w:tc>
@@ -2140,7 +2140,7 @@
                 <w:color w:val="C8900A"/>
                 <w:sz w:val="17"/>
               </w:rPr>
-              <w:t>⚠ Budget-capped</w:t>
+              <w:t>⚠ Budget-capped (↓ Apr)</w:t>
             </w:r>
           </w:p>
         </w:tc>
@@ -5636,6 +5636,434 @@
         <w:t>AUCTION INSIGHTS &amp; COMPETITION</w:t>
       </w:r>
     </w:p>
+    <w:p>
+      <w:pPr>
+        <w:spacing w:before="80" w:after="80"/>
+      </w:pPr>
+      <w:r>
+        <w:rPr>
+          <w:b/>
+          <w:i w:val="0"/>
+          <w:color w:val="0D2045"/>
+          <w:sz w:val="17"/>
+        </w:rPr>
+        <w:t>MAY 2026 — AUCTION INSIGHTS</w:t>
+      </w:r>
+    </w:p>
+    <w:tbl>
+      <w:tblPr>
+        <w:tblStyle w:val="TableGrid"/>
+        <w:tblW w:type="auto" w:w="0"/>
+        <w:tblLook w:firstColumn="1" w:firstRow="1" w:lastColumn="0" w:lastRow="0" w:noHBand="0" w:noVBand="1" w:val="04A0"/>
+      </w:tblPr>
+      <w:tblGrid>
+        <w:gridCol w:w="1662"/>
+        <w:gridCol w:w="1662"/>
+        <w:gridCol w:w="1662"/>
+        <w:gridCol w:w="1662"/>
+        <w:gridCol w:w="1662"/>
+        <w:gridCol w:w="1662"/>
+      </w:tblGrid>
+      <w:tr>
+        <w:tc>
+          <w:tcPr>
+            <w:tcW w:type="dxa" w:w="1662"/>
+            <w:shd w:val="clear" w:color="auto" w:fill="0d2045"/>
+            <w:vAlign w:val="center"/>
+          </w:tcPr>
+          <w:p>
+            <w:pPr>
+              <w:jc w:val="left"/>
+            </w:pPr>
+            <w:r>
+              <w:rPr>
+                <w:b/>
+                <w:i w:val="0"/>
+                <w:color w:val="FFFFFF"/>
+                <w:sz w:val="16"/>
+              </w:rPr>
+              <w:t>Competitor</w:t>
+            </w:r>
+          </w:p>
+        </w:tc>
+        <w:tc>
+          <w:tcPr>
+            <w:tcW w:type="dxa" w:w="1662"/>
+            <w:shd w:val="clear" w:color="auto" w:fill="0d2045"/>
+            <w:vAlign w:val="center"/>
+          </w:tcPr>
+          <w:p>
+            <w:pPr>
+              <w:jc w:val="left"/>
+            </w:pPr>
+            <w:r>
+              <w:rPr>
+                <w:b/>
+                <w:i w:val="0"/>
+                <w:color w:val="FFFFFF"/>
+                <w:sz w:val="16"/>
+              </w:rPr>
+              <w:t>Impr. Share</w:t>
+            </w:r>
+          </w:p>
+        </w:tc>
+        <w:tc>
+          <w:tcPr>
+            <w:tcW w:type="dxa" w:w="1662"/>
+            <w:shd w:val="clear" w:color="auto" w:fill="0d2045"/>
+            <w:vAlign w:val="center"/>
+          </w:tcPr>
+          <w:p>
+            <w:pPr>
+              <w:jc w:val="left"/>
+            </w:pPr>
+            <w:r>
+              <w:rPr>
+                <w:b/>
+                <w:i w:val="0"/>
+                <w:color w:val="FFFFFF"/>
+                <w:sz w:val="16"/>
+              </w:rPr>
+              <w:t>Overlap Rate</w:t>
+            </w:r>
+          </w:p>
+        </w:tc>
+        <w:tc>
+          <w:tcPr>
+            <w:tcW w:type="dxa" w:w="1662"/>
+            <w:shd w:val="clear" w:color="auto" w:fill="0d2045"/>
+            <w:vAlign w:val="center"/>
+          </w:tcPr>
+          <w:p>
+            <w:pPr>
+              <w:jc w:val="left"/>
+            </w:pPr>
+            <w:r>
+              <w:rPr>
+                <w:b/>
+                <w:i w:val="0"/>
+                <w:color w:val="FFFFFF"/>
+                <w:sz w:val="16"/>
+              </w:rPr>
+              <w:t>Pos. Above Rate</w:t>
+            </w:r>
+          </w:p>
+        </w:tc>
+        <w:tc>
+          <w:tcPr>
+            <w:tcW w:type="dxa" w:w="1662"/>
+            <w:shd w:val="clear" w:color="auto" w:fill="0d2045"/>
+            <w:vAlign w:val="center"/>
+          </w:tcPr>
+          <w:p>
+            <w:pPr>
+              <w:jc w:val="left"/>
+            </w:pPr>
+            <w:r>
+              <w:rPr>
+                <w:b/>
+                <w:i w:val="0"/>
+                <w:color w:val="FFFFFF"/>
+                <w:sz w:val="16"/>
+              </w:rPr>
+              <w:t>Top of Page Rate</w:t>
+            </w:r>
+          </w:p>
+        </w:tc>
+        <w:tc>
+          <w:tcPr>
+            <w:tcW w:type="dxa" w:w="1662"/>
+            <w:shd w:val="clear" w:color="auto" w:fill="0d2045"/>
+            <w:vAlign w:val="center"/>
+          </w:tcPr>
+          <w:p>
+            <w:pPr>
+              <w:jc w:val="left"/>
+            </w:pPr>
+            <w:r>
+              <w:rPr>
+                <w:b/>
+                <w:i w:val="0"/>
+                <w:color w:val="FFFFFF"/>
+                <w:sz w:val="16"/>
+              </w:rPr>
+              <w:t>Abs. Top of Page</w:t>
+            </w:r>
+          </w:p>
+        </w:tc>
+      </w:tr>
+      <w:tr>
+        <w:tc>
+          <w:tcPr>
+            <w:tcW w:type="dxa" w:w="1662"/>
+            <w:shd w:val="clear" w:color="auto" w:fill="EEF4FB"/>
+            <w:vAlign w:val="center"/>
+          </w:tcPr>
+          <w:p>
+            <w:pPr>
+              <w:jc w:val="left"/>
+            </w:pPr>
+            <w:r>
+              <w:rPr>
+                <w:b/>
+                <w:i w:val="0"/>
+                <w:color w:val="0D2045"/>
+                <w:sz w:val="18"/>
+              </w:rPr>
+              <w:t>Johnsons (You)</w:t>
+            </w:r>
+          </w:p>
+        </w:tc>
+        <w:tc>
+          <w:tcPr>
+            <w:tcW w:type="dxa" w:w="1662"/>
+            <w:shd w:val="clear" w:color="auto" w:fill="EEF4FB"/>
+            <w:vAlign w:val="center"/>
+          </w:tcPr>
+          <w:p>
+            <w:pPr>
+              <w:jc w:val="left"/>
+            </w:pPr>
+            <w:r>
+              <w:rPr>
+                <w:b/>
+                <w:i w:val="0"/>
+                <w:color w:val="0D2045"/>
+                <w:sz w:val="18"/>
+              </w:rPr>
+              <w:t>11.64%</w:t>
+            </w:r>
+          </w:p>
+        </w:tc>
+        <w:tc>
+          <w:tcPr>
+            <w:tcW w:type="dxa" w:w="1662"/>
+            <w:shd w:val="clear" w:color="auto" w:fill="EEF4FB"/>
+            <w:vAlign w:val="center"/>
+          </w:tcPr>
+          <w:p>
+            <w:pPr>
+              <w:jc w:val="left"/>
+            </w:pPr>
+            <w:r>
+              <w:rPr>
+                <w:b/>
+                <w:i w:val="0"/>
+                <w:color w:val="0D2045"/>
+                <w:sz w:val="18"/>
+              </w:rPr>
+              <w:t>—</w:t>
+            </w:r>
+          </w:p>
+        </w:tc>
+        <w:tc>
+          <w:tcPr>
+            <w:tcW w:type="dxa" w:w="1662"/>
+            <w:shd w:val="clear" w:color="auto" w:fill="EEF4FB"/>
+            <w:vAlign w:val="center"/>
+          </w:tcPr>
+          <w:p>
+            <w:pPr>
+              <w:jc w:val="left"/>
+            </w:pPr>
+            <w:r>
+              <w:rPr>
+                <w:b/>
+                <w:i w:val="0"/>
+                <w:color w:val="0D2045"/>
+                <w:sz w:val="18"/>
+              </w:rPr>
+              <w:t>—</w:t>
+            </w:r>
+          </w:p>
+        </w:tc>
+        <w:tc>
+          <w:tcPr>
+            <w:tcW w:type="dxa" w:w="1662"/>
+            <w:shd w:val="clear" w:color="auto" w:fill="EEF4FB"/>
+            <w:vAlign w:val="center"/>
+          </w:tcPr>
+          <w:p>
+            <w:pPr>
+              <w:jc w:val="left"/>
+            </w:pPr>
+            <w:r>
+              <w:rPr>
+                <w:b/>
+                <w:i w:val="0"/>
+                <w:color w:val="0D2045"/>
+                <w:sz w:val="18"/>
+              </w:rPr>
+              <w:t>28.03%</w:t>
+            </w:r>
+          </w:p>
+        </w:tc>
+        <w:tc>
+          <w:tcPr>
+            <w:tcW w:type="dxa" w:w="1662"/>
+            <w:shd w:val="clear" w:color="auto" w:fill="EEF4FB"/>
+            <w:vAlign w:val="center"/>
+          </w:tcPr>
+          <w:p>
+            <w:pPr>
+              <w:jc w:val="left"/>
+            </w:pPr>
+            <w:r>
+              <w:rPr>
+                <w:b/>
+                <w:i w:val="0"/>
+                <w:color w:val="0D2045"/>
+                <w:sz w:val="18"/>
+              </w:rPr>
+              <w:t>22.73%</w:t>
+            </w:r>
+          </w:p>
+        </w:tc>
+      </w:tr>
+      <w:tr>
+        <w:tc>
+          <w:tcPr>
+            <w:tcW w:type="dxa" w:w="1662"/>
+            <w:shd w:val="clear" w:color="auto" w:fill="FFFFFF"/>
+            <w:vAlign w:val="center"/>
+          </w:tcPr>
+          <w:p>
+            <w:pPr>
+              <w:jc w:val="left"/>
+            </w:pPr>
+            <w:r>
+              <w:rPr>
+                <w:b w:val="0"/>
+                <w:i w:val="0"/>
+                <w:color w:val="1A2A3A"/>
+                <w:sz w:val="18"/>
+              </w:rPr>
+              <w:t>onthemarket.com</w:t>
+            </w:r>
+          </w:p>
+        </w:tc>
+        <w:tc>
+          <w:tcPr>
+            <w:tcW w:type="dxa" w:w="1662"/>
+            <w:shd w:val="clear" w:color="auto" w:fill="FFFFFF"/>
+            <w:vAlign w:val="center"/>
+          </w:tcPr>
+          <w:p>
+            <w:pPr>
+              <w:jc w:val="left"/>
+            </w:pPr>
+            <w:r>
+              <w:rPr>
+                <w:b w:val="0"/>
+                <w:i w:val="0"/>
+                <w:color w:val="1A2A3A"/>
+                <w:sz w:val="18"/>
+              </w:rPr>
+              <w:t>19.22%</w:t>
+            </w:r>
+          </w:p>
+        </w:tc>
+        <w:tc>
+          <w:tcPr>
+            <w:tcW w:type="dxa" w:w="1662"/>
+            <w:shd w:val="clear" w:color="auto" w:fill="FFFFFF"/>
+            <w:vAlign w:val="center"/>
+          </w:tcPr>
+          <w:p>
+            <w:pPr>
+              <w:jc w:val="left"/>
+            </w:pPr>
+            <w:r>
+              <w:rPr>
+                <w:b w:val="0"/>
+                <w:i w:val="0"/>
+                <w:color w:val="1A2A3A"/>
+                <w:sz w:val="18"/>
+              </w:rPr>
+              <w:t>9.85%</w:t>
+            </w:r>
+          </w:p>
+        </w:tc>
+        <w:tc>
+          <w:tcPr>
+            <w:tcW w:type="dxa" w:w="1662"/>
+            <w:shd w:val="clear" w:color="auto" w:fill="FFFFFF"/>
+            <w:vAlign w:val="center"/>
+          </w:tcPr>
+          <w:p>
+            <w:pPr>
+              <w:jc w:val="left"/>
+            </w:pPr>
+            <w:r>
+              <w:rPr>
+                <w:b w:val="0"/>
+                <w:i w:val="0"/>
+                <w:color w:val="1A2A3A"/>
+                <w:sz w:val="18"/>
+              </w:rPr>
+              <w:t>61.54%</w:t>
+            </w:r>
+          </w:p>
+        </w:tc>
+        <w:tc>
+          <w:tcPr>
+            <w:tcW w:type="dxa" w:w="1662"/>
+            <w:shd w:val="clear" w:color="auto" w:fill="FFFFFF"/>
+            <w:vAlign w:val="center"/>
+          </w:tcPr>
+          <w:p>
+            <w:pPr>
+              <w:jc w:val="left"/>
+            </w:pPr>
+            <w:r>
+              <w:rPr>
+                <w:b w:val="0"/>
+                <w:i w:val="0"/>
+                <w:color w:val="1A2A3A"/>
+                <w:sz w:val="18"/>
+              </w:rPr>
+              <w:t>88.07%</w:t>
+            </w:r>
+          </w:p>
+        </w:tc>
+        <w:tc>
+          <w:tcPr>
+            <w:tcW w:type="dxa" w:w="1662"/>
+            <w:shd w:val="clear" w:color="auto" w:fill="FFFFFF"/>
+            <w:vAlign w:val="center"/>
+          </w:tcPr>
+          <w:p>
+            <w:pPr>
+              <w:jc w:val="left"/>
+            </w:pPr>
+            <w:r>
+              <w:rPr>
+                <w:b w:val="0"/>
+                <w:i w:val="0"/>
+                <w:color w:val="1A2A3A"/>
+                <w:sz w:val="18"/>
+              </w:rPr>
+              <w:t>17.89%</w:t>
+            </w:r>
+          </w:p>
+        </w:tc>
+      </w:tr>
+    </w:tbl>
+    <w:p/>
+    <w:p>
+      <w:pPr>
+        <w:spacing w:before="80" w:after="80"/>
+      </w:pPr>
+      <w:r>
+        <w:rPr>
+          <w:b/>
+          <w:i w:val="0"/>
+          <w:color w:val="0D2045"/>
+          <w:sz w:val="17"/>
+        </w:rPr>
+        <w:t>APRIL 2026 — AUCTION INSIGHTS (for reference)</w:t>
+      </w:r>
+    </w:p>
     <w:tbl>
       <w:tblPr>
         <w:tblStyle w:val="TableGrid"/>
@@ -6086,17 +6514,17 @@
       <w:r>
         <w:rPr>
           <w:b/>
-          <w:color w:val="0A5A20"/>
+          <w:color w:val="C8900A"/>
           <w:sz w:val="18"/>
         </w:rPr>
-        <w:t xml:space="preserve">✓  Significant Structural Advantage: </w:t>
+        <w:t xml:space="preserve">⚠  onthemarket.com Impression Share Nearly Doubled: </w:t>
       </w:r>
       <w:r>
         <w:rPr>
           <w:color w:val="1A2A3A"/>
           <w:sz w:val="18"/>
         </w:rPr>
-        <w:t>Both competitors hold less than 10% impression share. Rightmove, Zoopla, and all major portals are entirely absent from valuation-intent keyword auctions. Johnsons' 20.26% impression share is budget-constrained, not competition-constrained — every additional pound of budget goes into largely uncontested space.</w:t>
+        <w:t>onthemarket.com grew from &lt;10% in April to 19.22% in May — now outranking Johnsons on impression share. Their position above rate of 61.54% means they appear above Johnsons in the majority of overlapping auctions. churchill-living.co.uk dropped out entirely. Johnsons' impression share fell from 20.26% to 11.64% — the primary driver is budget constraint (£13.25/day), not ad quality.</w:t>
       </w:r>
     </w:p>
     <w:p>

</xml_diff>